<commit_message>
conveyance still adjusting fize
</commit_message>
<xml_diff>
--- a/templates/FSED-38F-Conveyance.docx
+++ b/templates/FSED-38F-Conveyance.docx
@@ -379,7 +379,7 @@
               <wp:anchor distT="0" distB="0" distL="114300" distR="114300" simplePos="0" relativeHeight="251677696" behindDoc="0" locked="0" layoutInCell="1" allowOverlap="1">
                 <wp:simplePos x="0" y="0"/>
                 <wp:positionH relativeFrom="column">
-                  <wp:posOffset>2016125</wp:posOffset>
+                  <wp:posOffset>2035175</wp:posOffset>
                 </wp:positionH>
                 <wp:positionV relativeFrom="paragraph">
                   <wp:posOffset>104775</wp:posOffset>
@@ -475,7 +475,7 @@
           </mc:Choice>
           <mc:Fallback>
             <w:pict>
-              <v:shape id="_x0000_s1026" o:spid="_x0000_s1026" o:spt="202" type="#_x0000_t202" style="position:absolute;left:0pt;margin-left:158.75pt;margin-top:8.25pt;height:27pt;width:201.9pt;z-index:251677696;mso-width-relative:page;mso-height-relative:page;" filled="f" stroked="f" coordsize="21600,21600" o:gfxdata="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">
+              <v:shape id="_x0000_s1026" o:spid="_x0000_s1026" o:spt="202" type="#_x0000_t202" style="position:absolute;left:0pt;margin-left:160.25pt;margin-top:8.25pt;height:27pt;width:201.9pt;z-index:251677696;mso-width-relative:page;mso-height-relative:page;" filled="f" stroked="f" coordsize="21600,21600" o:gfxdata="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">
                 <v:fill on="f" focussize="0,0"/>
                 <v:stroke on="f" weight="0.5pt"/>
                 <v:imagedata o:title=""/>
@@ -1066,6 +1066,8 @@
         </w:rPr>
         <w:t>FIRE SAFETY CLEARANCE</w:t>
       </w:r>
+      <w:bookmarkStart w:id="0" w:name="_GoBack"/>
+      <w:bookmarkEnd w:id="0"/>
     </w:p>
     <w:p>
       <w:pPr>
@@ -1493,8 +1495,6 @@
         </w:rPr>
         <w:t xml:space="preserve">located at ____________________________________________________________________ </w:t>
       </w:r>
-      <w:bookmarkStart w:id="0" w:name="_GoBack"/>
-      <w:bookmarkEnd w:id="0"/>
     </w:p>
     <w:p>
       <w:pPr>
@@ -1700,15 +1700,169 @@
         <mc:AlternateContent>
           <mc:Choice Requires="wps">
             <w:drawing>
+              <wp:anchor distT="0" distB="0" distL="114300" distR="114300" simplePos="0" relativeHeight="251683840" behindDoc="0" locked="0" layoutInCell="1" allowOverlap="1">
+                <wp:simplePos x="0" y="0"/>
+                <wp:positionH relativeFrom="column">
+                  <wp:posOffset>-408305</wp:posOffset>
+                </wp:positionH>
+                <wp:positionV relativeFrom="paragraph">
+                  <wp:posOffset>107950</wp:posOffset>
+                </wp:positionV>
+                <wp:extent cx="3284855" cy="342900"/>
+                <wp:effectExtent l="0" t="0" r="0" b="0"/>
+                <wp:wrapNone/>
+                <wp:docPr id="27" name="Text Box 27"/>
+                <wp:cNvGraphicFramePr/>
+                <a:graphic xmlns:a="http://schemas.openxmlformats.org/drawingml/2006/main">
+                  <a:graphicData uri="http://schemas.microsoft.com/office/word/2010/wordprocessingShape">
+                    <wps:wsp>
+                      <wps:cNvSpPr txBox="1"/>
+                      <wps:spPr>
+                        <a:xfrm>
+                          <a:off x="0" y="0"/>
+                          <a:ext cx="3284855" cy="342900"/>
+                        </a:xfrm>
+                        <a:prstGeom prst="rect">
+                          <a:avLst/>
+                        </a:prstGeom>
+                        <a:noFill/>
+                        <a:ln w="6350">
+                          <a:noFill/>
+                        </a:ln>
+                        <a:effectLst/>
+                      </wps:spPr>
+                      <wps:style>
+                        <a:lnRef idx="0">
+                          <a:schemeClr val="accent1"/>
+                        </a:lnRef>
+                        <a:fillRef idx="0">
+                          <a:schemeClr val="accent1"/>
+                        </a:fillRef>
+                        <a:effectRef idx="0">
+                          <a:schemeClr val="accent1"/>
+                        </a:effectRef>
+                        <a:fontRef idx="minor">
+                          <a:schemeClr val="dk1"/>
+                        </a:fontRef>
+                      </wps:style>
+                      <wps:txbx>
+                        <w:txbxContent>
+                          <w:p>
+                            <w:pPr>
+                              <w:spacing w:after="0" w:line="240" w:lineRule="auto"/>
+                              <w:jc w:val="center"/>
+                              <w:rPr>
+                                <w:rFonts w:hint="default" w:ascii="Calibri" w:hAnsi="Calibri" w:eastAsia="Times New Roman" w:cs="Calibri"/>
+                                <w:b w:val="0"/>
+                                <w:bCs w:val="0"/>
+                                <w:color w:val="000000"/>
+                                <w:sz w:val="22"/>
+                                <w:szCs w:val="22"/>
+                                <w:lang w:val="en-US"/>
+                              </w:rPr>
+                            </w:pPr>
+                            <w:r>
+                              <w:rPr>
+                                <w:rFonts w:hint="default" w:ascii="Calibri" w:hAnsi="Calibri" w:eastAsia="Times New Roman" w:cs="Calibri"/>
+                                <w:b w:val="0"/>
+                                <w:bCs w:val="0"/>
+                                <w:color w:val="000000"/>
+                                <w:sz w:val="22"/>
+                                <w:szCs w:val="22"/>
+                                <w:lang w:val="en-US"/>
+                              </w:rPr>
+                              <w:t>{TYPE_OF_VEHICLE}</w:t>
+                            </w:r>
+                          </w:p>
+                          <w:p>
+                            <w:pPr>
+                              <w:rPr>
+                                <w:rFonts w:hint="default"/>
+                                <w:lang w:val="en-US"/>
+                              </w:rPr>
+                            </w:pPr>
+                          </w:p>
+                        </w:txbxContent>
+                      </wps:txbx>
+                      <wps:bodyPr rot="0" spcFirstLastPara="0" vertOverflow="overflow" horzOverflow="overflow" vert="horz" wrap="square" lIns="91440" tIns="45720" rIns="91440" bIns="45720" numCol="1" spcCol="0" rtlCol="0" fromWordArt="0" anchor="t" anchorCtr="0" forceAA="0" compatLnSpc="1">
+                        <a:noAutofit/>
+                      </wps:bodyPr>
+                    </wps:wsp>
+                  </a:graphicData>
+                </a:graphic>
+              </wp:anchor>
+            </w:drawing>
+          </mc:Choice>
+          <mc:Fallback>
+            <w:pict>
+              <v:shape id="_x0000_s1026" o:spid="_x0000_s1026" o:spt="202" type="#_x0000_t202" style="position:absolute;left:0pt;margin-left:-32.15pt;margin-top:8.5pt;height:27pt;width:258.65pt;z-index:251683840;mso-width-relative:page;mso-height-relative:page;" filled="f" stroked="f" coordsize="21600,21600" o:gfxdata="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">
+                <v:fill on="f" focussize="0,0"/>
+                <v:stroke on="f" weight="0.5pt"/>
+                <v:imagedata o:title=""/>
+                <o:lock v:ext="edit" aspectratio="f"/>
+                <v:textbox>
+                  <w:txbxContent>
+                    <w:p>
+                      <w:pPr>
+                        <w:spacing w:after="0" w:line="240" w:lineRule="auto"/>
+                        <w:jc w:val="center"/>
+                        <w:rPr>
+                          <w:rFonts w:hint="default" w:ascii="Calibri" w:hAnsi="Calibri" w:eastAsia="Times New Roman" w:cs="Calibri"/>
+                          <w:b w:val="0"/>
+                          <w:bCs w:val="0"/>
+                          <w:color w:val="000000"/>
+                          <w:sz w:val="22"/>
+                          <w:szCs w:val="22"/>
+                          <w:lang w:val="en-US"/>
+                        </w:rPr>
+                      </w:pPr>
+                      <w:r>
+                        <w:rPr>
+                          <w:rFonts w:hint="default" w:ascii="Calibri" w:hAnsi="Calibri" w:eastAsia="Times New Roman" w:cs="Calibri"/>
+                          <w:b w:val="0"/>
+                          <w:bCs w:val="0"/>
+                          <w:color w:val="000000"/>
+                          <w:sz w:val="22"/>
+                          <w:szCs w:val="22"/>
+                          <w:lang w:val="en-US"/>
+                        </w:rPr>
+                        <w:t>{TYPE_OF_VEHICLE}</w:t>
+                      </w:r>
+                    </w:p>
+                    <w:p>
+                      <w:pPr>
+                        <w:rPr>
+                          <w:rFonts w:hint="default"/>
+                          <w:lang w:val="en-US"/>
+                        </w:rPr>
+                      </w:pPr>
+                    </w:p>
+                  </w:txbxContent>
+                </v:textbox>
+              </v:shape>
+            </w:pict>
+          </mc:Fallback>
+        </mc:AlternateContent>
+      </w:r>
+      <w:r>
+        <w:rPr>
+          <w:rFonts w:ascii="Arial" w:hAnsi="Arial" w:cs="Arial"/>
+          <w:sz w:val="24"/>
+          <w:szCs w:val="24"/>
+          <w:lang w:val="en-US" w:eastAsia="en-US"/>
+        </w:rPr>
+        <mc:AlternateContent>
+          <mc:Choice Requires="wps">
+            <w:drawing>
               <wp:anchor distT="0" distB="0" distL="114300" distR="114300" simplePos="0" relativeHeight="251682816" behindDoc="0" locked="0" layoutInCell="1" allowOverlap="1">
                 <wp:simplePos x="0" y="0"/>
                 <wp:positionH relativeFrom="column">
-                  <wp:posOffset>2877185</wp:posOffset>
+                  <wp:posOffset>2564130</wp:posOffset>
                 </wp:positionH>
                 <wp:positionV relativeFrom="paragraph">
                   <wp:posOffset>98425</wp:posOffset>
                 </wp:positionV>
-                <wp:extent cx="2818765" cy="342900"/>
+                <wp:extent cx="3131820" cy="342900"/>
                 <wp:effectExtent l="0" t="0" r="0" b="0"/>
                 <wp:wrapNone/>
                 <wp:docPr id="26" name="Text Box 26"/>
@@ -1720,7 +1874,7 @@
                       <wps:spPr>
                         <a:xfrm>
                           <a:off x="0" y="0"/>
-                          <a:ext cx="2818765" cy="342900"/>
+                          <a:ext cx="3131820" cy="342900"/>
                         </a:xfrm>
                         <a:prstGeom prst="rect">
                           <a:avLst/>
@@ -1795,7 +1949,7 @@
           </mc:Choice>
           <mc:Fallback>
             <w:pict>
-              <v:shape id="_x0000_s1026" o:spid="_x0000_s1026" o:spt="202" type="#_x0000_t202" style="position:absolute;left:0pt;margin-left:226.55pt;margin-top:7.75pt;height:27pt;width:221.95pt;z-index:251682816;mso-width-relative:page;mso-height-relative:page;" filled="f" stroked="f" coordsize="21600,21600" o:gfxdata="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">
+              <v:shape id="_x0000_s1026" o:spid="_x0000_s1026" o:spt="202" type="#_x0000_t202" style="position:absolute;left:0pt;margin-left:201.9pt;margin-top:7.75pt;height:27pt;width:246.6pt;z-index:251682816;mso-width-relative:page;mso-height-relative:page;" filled="f" stroked="f" coordsize="21600,21600" o:gfxdata="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">
                 <v:fill on="f" focussize="0,0"/>
                 <v:stroke on="f" weight="0.5pt"/>
                 <v:imagedata o:title=""/>
@@ -1827,160 +1981,6 @@
                           <w:lang w:val="en-US"/>
                         </w:rPr>
                         <w:t>{PLATE_NUMBER}</w:t>
-                      </w:r>
-                    </w:p>
-                    <w:p>
-                      <w:pPr>
-                        <w:rPr>
-                          <w:rFonts w:hint="default"/>
-                          <w:lang w:val="en-US"/>
-                        </w:rPr>
-                      </w:pPr>
-                    </w:p>
-                  </w:txbxContent>
-                </v:textbox>
-              </v:shape>
-            </w:pict>
-          </mc:Fallback>
-        </mc:AlternateContent>
-      </w:r>
-      <w:r>
-        <w:rPr>
-          <w:rFonts w:ascii="Arial" w:hAnsi="Arial" w:cs="Arial"/>
-          <w:sz w:val="24"/>
-          <w:szCs w:val="24"/>
-          <w:lang w:val="en-US" w:eastAsia="en-US"/>
-        </w:rPr>
-        <mc:AlternateContent>
-          <mc:Choice Requires="wps">
-            <w:drawing>
-              <wp:anchor distT="0" distB="0" distL="114300" distR="114300" simplePos="0" relativeHeight="251683840" behindDoc="0" locked="0" layoutInCell="1" allowOverlap="1">
-                <wp:simplePos x="0" y="0"/>
-                <wp:positionH relativeFrom="column">
-                  <wp:posOffset>19685</wp:posOffset>
-                </wp:positionH>
-                <wp:positionV relativeFrom="paragraph">
-                  <wp:posOffset>107950</wp:posOffset>
-                </wp:positionV>
-                <wp:extent cx="2856865" cy="342900"/>
-                <wp:effectExtent l="0" t="0" r="0" b="0"/>
-                <wp:wrapNone/>
-                <wp:docPr id="27" name="Text Box 27"/>
-                <wp:cNvGraphicFramePr/>
-                <a:graphic xmlns:a="http://schemas.openxmlformats.org/drawingml/2006/main">
-                  <a:graphicData uri="http://schemas.microsoft.com/office/word/2010/wordprocessingShape">
-                    <wps:wsp>
-                      <wps:cNvSpPr txBox="1"/>
-                      <wps:spPr>
-                        <a:xfrm>
-                          <a:off x="0" y="0"/>
-                          <a:ext cx="2856865" cy="342900"/>
-                        </a:xfrm>
-                        <a:prstGeom prst="rect">
-                          <a:avLst/>
-                        </a:prstGeom>
-                        <a:noFill/>
-                        <a:ln w="6350">
-                          <a:noFill/>
-                        </a:ln>
-                        <a:effectLst/>
-                      </wps:spPr>
-                      <wps:style>
-                        <a:lnRef idx="0">
-                          <a:schemeClr val="accent1"/>
-                        </a:lnRef>
-                        <a:fillRef idx="0">
-                          <a:schemeClr val="accent1"/>
-                        </a:fillRef>
-                        <a:effectRef idx="0">
-                          <a:schemeClr val="accent1"/>
-                        </a:effectRef>
-                        <a:fontRef idx="minor">
-                          <a:schemeClr val="dk1"/>
-                        </a:fontRef>
-                      </wps:style>
-                      <wps:txbx>
-                        <w:txbxContent>
-                          <w:p>
-                            <w:pPr>
-                              <w:spacing w:after="0" w:line="240" w:lineRule="auto"/>
-                              <w:jc w:val="center"/>
-                              <w:rPr>
-                                <w:rFonts w:hint="default" w:ascii="Calibri" w:hAnsi="Calibri" w:eastAsia="Times New Roman" w:cs="Calibri"/>
-                                <w:b w:val="0"/>
-                                <w:bCs w:val="0"/>
-                                <w:color w:val="000000"/>
-                                <w:sz w:val="22"/>
-                                <w:szCs w:val="22"/>
-                                <w:lang w:val="en-US"/>
-                              </w:rPr>
-                            </w:pPr>
-                            <w:r>
-                              <w:rPr>
-                                <w:rFonts w:hint="default" w:ascii="Calibri" w:hAnsi="Calibri" w:eastAsia="Times New Roman" w:cs="Calibri"/>
-                                <w:b w:val="0"/>
-                                <w:bCs w:val="0"/>
-                                <w:color w:val="000000"/>
-                                <w:sz w:val="22"/>
-                                <w:szCs w:val="22"/>
-                                <w:lang w:val="en-US"/>
-                              </w:rPr>
-                              <w:t>{TYPE_OF_VEHICLE}</w:t>
-                            </w:r>
-                          </w:p>
-                          <w:p>
-                            <w:pPr>
-                              <w:rPr>
-                                <w:rFonts w:hint="default"/>
-                                <w:lang w:val="en-US"/>
-                              </w:rPr>
-                            </w:pPr>
-                          </w:p>
-                        </w:txbxContent>
-                      </wps:txbx>
-                      <wps:bodyPr rot="0" spcFirstLastPara="0" vertOverflow="overflow" horzOverflow="overflow" vert="horz" wrap="square" lIns="91440" tIns="45720" rIns="91440" bIns="45720" numCol="1" spcCol="0" rtlCol="0" fromWordArt="0" anchor="t" anchorCtr="0" forceAA="0" compatLnSpc="1">
-                        <a:noAutofit/>
-                      </wps:bodyPr>
-                    </wps:wsp>
-                  </a:graphicData>
-                </a:graphic>
-              </wp:anchor>
-            </w:drawing>
-          </mc:Choice>
-          <mc:Fallback>
-            <w:pict>
-              <v:shape id="_x0000_s1026" o:spid="_x0000_s1026" o:spt="202" type="#_x0000_t202" style="position:absolute;left:0pt;margin-left:1.55pt;margin-top:8.5pt;height:27pt;width:224.95pt;z-index:251683840;mso-width-relative:page;mso-height-relative:page;" filled="f" stroked="f" coordsize="21600,21600" o:gfxdata="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">
-                <v:fill on="f" focussize="0,0"/>
-                <v:stroke on="f" weight="0.5pt"/>
-                <v:imagedata o:title=""/>
-                <o:lock v:ext="edit" aspectratio="f"/>
-                <v:textbox>
-                  <w:txbxContent>
-                    <w:p>
-                      <w:pPr>
-                        <w:spacing w:after="0" w:line="240" w:lineRule="auto"/>
-                        <w:jc w:val="center"/>
-                        <w:rPr>
-                          <w:rFonts w:hint="default" w:ascii="Calibri" w:hAnsi="Calibri" w:eastAsia="Times New Roman" w:cs="Calibri"/>
-                          <w:b w:val="0"/>
-                          <w:bCs w:val="0"/>
-                          <w:color w:val="000000"/>
-                          <w:sz w:val="22"/>
-                          <w:szCs w:val="22"/>
-                          <w:lang w:val="en-US"/>
-                        </w:rPr>
-                      </w:pPr>
-                      <w:r>
-                        <w:rPr>
-                          <w:rFonts w:hint="default" w:ascii="Calibri" w:hAnsi="Calibri" w:eastAsia="Times New Roman" w:cs="Calibri"/>
-                          <w:b w:val="0"/>
-                          <w:bCs w:val="0"/>
-                          <w:color w:val="000000"/>
-                          <w:sz w:val="22"/>
-                          <w:szCs w:val="22"/>
-                          <w:lang w:val="en-US"/>
-                        </w:rPr>
-                        <w:t>{TYPE_OF_VEHICLE}</w:t>
                       </w:r>
                     </w:p>
                     <w:p>
@@ -2065,12 +2065,12 @@
                     <wp:anchor distT="0" distB="0" distL="114300" distR="114300" simplePos="0" relativeHeight="251684864" behindDoc="0" locked="0" layoutInCell="1" allowOverlap="1">
                       <wp:simplePos x="0" y="0"/>
                       <wp:positionH relativeFrom="column">
-                        <wp:posOffset>635</wp:posOffset>
+                        <wp:posOffset>-485140</wp:posOffset>
                       </wp:positionH>
                       <wp:positionV relativeFrom="paragraph">
                         <wp:posOffset>109855</wp:posOffset>
                       </wp:positionV>
-                      <wp:extent cx="2809240" cy="342900"/>
+                      <wp:extent cx="3295015" cy="342900"/>
                       <wp:effectExtent l="0" t="0" r="0" b="0"/>
                       <wp:wrapNone/>
                       <wp:docPr id="28" name="Text Box 28"/>
@@ -2082,7 +2082,7 @@
                             <wps:spPr>
                               <a:xfrm>
                                 <a:off x="0" y="0"/>
-                                <a:ext cx="2809240" cy="342900"/>
+                                <a:ext cx="3295015" cy="342900"/>
                               </a:xfrm>
                               <a:prstGeom prst="rect">
                                 <a:avLst/>
@@ -2158,7 +2158,7 @@
                 </mc:Choice>
                 <mc:Fallback>
                   <w:pict>
-                    <v:shape id="_x0000_s1026" o:spid="_x0000_s1026" o:spt="202" type="#_x0000_t202" style="position:absolute;left:0pt;margin-left:0.05pt;margin-top:8.65pt;height:27pt;width:221.2pt;z-index:251684864;mso-width-relative:page;mso-height-relative:page;" filled="f" stroked="f" coordsize="21600,21600" o:gfxdata="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">
+                    <v:shape id="_x0000_s1026" o:spid="_x0000_s1026" o:spt="202" type="#_x0000_t202" style="position:absolute;left:0pt;margin-left:-38.2pt;margin-top:8.65pt;height:27pt;width:259.45pt;z-index:251684864;mso-width-relative:page;mso-height-relative:page;" filled="f" stroked="f" coordsize="21600,21600" o:gfxdata="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">
                       <v:fill on="f" focussize="0,0"/>
                       <v:stroke on="f" weight="0.5pt"/>
                       <v:imagedata o:title=""/>
@@ -2211,25 +2211,6 @@
             <w:r>
               <w:rPr>
                 <w:rFonts w:ascii="Arial" w:hAnsi="Arial" w:cs="Arial"/>
-              </w:rPr>
-              <w:t>Type of Vehicle: _____________________</w:t>
-            </w:r>
-          </w:p>
-        </w:tc>
-        <w:tc>
-          <w:tcPr>
-            <w:tcW w:w="4788" w:type="dxa"/>
-          </w:tcPr>
-          <w:p>
-            <w:pPr>
-              <w:spacing w:after="0" w:line="240" w:lineRule="auto"/>
-              <w:rPr>
-                <w:rFonts w:ascii="Arial" w:hAnsi="Arial" w:cs="Arial"/>
-              </w:rPr>
-            </w:pPr>
-            <w:r>
-              <w:rPr>
-                <w:rFonts w:ascii="Arial" w:hAnsi="Arial" w:cs="Arial"/>
                 <w:sz w:val="24"/>
                 <w:szCs w:val="24"/>
                 <w:lang w:val="en-US" w:eastAsia="en-US"/>
@@ -2240,12 +2221,12 @@
                     <wp:anchor distT="0" distB="0" distL="114300" distR="114300" simplePos="0" relativeHeight="251681792" behindDoc="0" locked="0" layoutInCell="1" allowOverlap="1">
                       <wp:simplePos x="0" y="0"/>
                       <wp:positionH relativeFrom="column">
-                        <wp:posOffset>-1905</wp:posOffset>
+                        <wp:posOffset>2686050</wp:posOffset>
                       </wp:positionH>
                       <wp:positionV relativeFrom="paragraph">
                         <wp:posOffset>100330</wp:posOffset>
                       </wp:positionV>
-                      <wp:extent cx="2924175" cy="342900"/>
+                      <wp:extent cx="3276600" cy="342900"/>
                       <wp:effectExtent l="0" t="0" r="0" b="0"/>
                       <wp:wrapNone/>
                       <wp:docPr id="15" name="Text Box 15"/>
@@ -2257,7 +2238,7 @@
                             <wps:spPr>
                               <a:xfrm>
                                 <a:off x="0" y="0"/>
-                                <a:ext cx="2924175" cy="342900"/>
+                                <a:ext cx="3276600" cy="342900"/>
                               </a:xfrm>
                               <a:prstGeom prst="rect">
                                 <a:avLst/>
@@ -2332,7 +2313,7 @@
                 </mc:Choice>
                 <mc:Fallback>
                   <w:pict>
-                    <v:shape id="_x0000_s1026" o:spid="_x0000_s1026" o:spt="202" type="#_x0000_t202" style="position:absolute;left:0pt;margin-left:-0.15pt;margin-top:7.9pt;height:27pt;width:230.25pt;z-index:251681792;mso-width-relative:page;mso-height-relative:page;" filled="f" stroked="f" coordsize="21600,21600" o:gfxdata="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">
+                    <v:shape id="_x0000_s1026" o:spid="_x0000_s1026" o:spt="202" type="#_x0000_t202" style="position:absolute;left:0pt;margin-left:211.5pt;margin-top:7.9pt;height:27pt;width:258pt;z-index:251681792;mso-width-relative:page;mso-height-relative:page;" filled="f" stroked="f" coordsize="21600,21600" o:gfxdata="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">
                       <v:fill on="f" focussize="0,0"/>
                       <v:stroke on="f" weight="0.5pt"/>
                       <v:imagedata o:title=""/>
@@ -2385,6 +2366,25 @@
               <w:rPr>
                 <w:rFonts w:ascii="Arial" w:hAnsi="Arial" w:cs="Arial"/>
               </w:rPr>
+              <w:t>Type of Vehicle: _____________________</w:t>
+            </w:r>
+          </w:p>
+        </w:tc>
+        <w:tc>
+          <w:tcPr>
+            <w:tcW w:w="4788" w:type="dxa"/>
+          </w:tcPr>
+          <w:p>
+            <w:pPr>
+              <w:spacing w:after="0" w:line="240" w:lineRule="auto"/>
+              <w:rPr>
+                <w:rFonts w:ascii="Arial" w:hAnsi="Arial" w:cs="Arial"/>
+              </w:rPr>
+            </w:pPr>
+            <w:r>
+              <w:rPr>
+                <w:rFonts w:ascii="Arial" w:hAnsi="Arial" w:cs="Arial"/>
+              </w:rPr>
               <w:t>PlateNumber:_________________________</w:t>
             </w:r>
           </w:p>
@@ -2431,12 +2431,12 @@
                     <wp:anchor distT="0" distB="0" distL="114300" distR="114300" simplePos="0" relativeHeight="251685888" behindDoc="0" locked="0" layoutInCell="1" allowOverlap="1">
                       <wp:simplePos x="0" y="0"/>
                       <wp:positionH relativeFrom="column">
-                        <wp:posOffset>38735</wp:posOffset>
+                        <wp:posOffset>-370840</wp:posOffset>
                       </wp:positionH>
                       <wp:positionV relativeFrom="paragraph">
                         <wp:posOffset>111125</wp:posOffset>
                       </wp:positionV>
-                      <wp:extent cx="2837815" cy="342900"/>
+                      <wp:extent cx="3247390" cy="342900"/>
                       <wp:effectExtent l="0" t="0" r="0" b="0"/>
                       <wp:wrapNone/>
                       <wp:docPr id="29" name="Text Box 29"/>
@@ -2448,7 +2448,7 @@
                             <wps:spPr>
                               <a:xfrm>
                                 <a:off x="0" y="0"/>
-                                <a:ext cx="2837815" cy="342900"/>
+                                <a:ext cx="3247390" cy="342900"/>
                               </a:xfrm>
                               <a:prstGeom prst="rect">
                                 <a:avLst/>
@@ -2523,7 +2523,7 @@
                 </mc:Choice>
                 <mc:Fallback>
                   <w:pict>
-                    <v:shape id="_x0000_s1026" o:spid="_x0000_s1026" o:spt="202" type="#_x0000_t202" style="position:absolute;left:0pt;margin-left:3.05pt;margin-top:8.75pt;height:27pt;width:223.45pt;z-index:251685888;mso-width-relative:page;mso-height-relative:page;" filled="f" stroked="f" coordsize="21600,21600" o:gfxdata="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">
+                    <v:shape id="_x0000_s1026" o:spid="_x0000_s1026" o:spt="202" type="#_x0000_t202" style="position:absolute;left:0pt;margin-left:-29.2pt;margin-top:8.75pt;height:27pt;width:255.7pt;z-index:251685888;mso-width-relative:page;mso-height-relative:page;" filled="f" stroked="f" coordsize="21600,21600" o:gfxdata="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">
                       <v:fill on="f" focussize="0,0"/>
                       <v:stroke on="f" weight="0.5pt"/>
                       <v:imagedata o:title=""/>
@@ -2575,25 +2575,6 @@
             <w:r>
               <w:rPr>
                 <w:rFonts w:ascii="Arial" w:hAnsi="Arial" w:cs="Arial"/>
-              </w:rPr>
-              <w:t>Motor Number:_______________________</w:t>
-            </w:r>
-          </w:p>
-        </w:tc>
-        <w:tc>
-          <w:tcPr>
-            <w:tcW w:w="4788" w:type="dxa"/>
-          </w:tcPr>
-          <w:p>
-            <w:pPr>
-              <w:spacing w:after="0" w:line="240" w:lineRule="auto"/>
-              <w:rPr>
-                <w:rFonts w:ascii="Arial" w:hAnsi="Arial" w:cs="Arial"/>
-              </w:rPr>
-            </w:pPr>
-            <w:r>
-              <w:rPr>
-                <w:rFonts w:ascii="Arial" w:hAnsi="Arial" w:cs="Arial"/>
                 <w:sz w:val="24"/>
                 <w:szCs w:val="24"/>
                 <w:lang w:val="en-US" w:eastAsia="en-US"/>
@@ -2604,12 +2585,12 @@
                     <wp:anchor distT="0" distB="0" distL="114300" distR="114300" simplePos="0" relativeHeight="251680768" behindDoc="0" locked="0" layoutInCell="1" allowOverlap="1">
                       <wp:simplePos x="0" y="0"/>
                       <wp:positionH relativeFrom="column">
-                        <wp:posOffset>-57785</wp:posOffset>
+                        <wp:posOffset>2449830</wp:posOffset>
                       </wp:positionH>
                       <wp:positionV relativeFrom="paragraph">
                         <wp:posOffset>101600</wp:posOffset>
                       </wp:positionV>
-                      <wp:extent cx="3008630" cy="342900"/>
+                      <wp:extent cx="3541395" cy="342900"/>
                       <wp:effectExtent l="0" t="0" r="0" b="0"/>
                       <wp:wrapNone/>
                       <wp:docPr id="1" name="Text Box 1"/>
@@ -2621,7 +2602,7 @@
                             <wps:spPr>
                               <a:xfrm>
                                 <a:off x="0" y="0"/>
-                                <a:ext cx="3008630" cy="342900"/>
+                                <a:ext cx="3541395" cy="342900"/>
                               </a:xfrm>
                               <a:prstGeom prst="rect">
                                 <a:avLst/>
@@ -2683,7 +2664,7 @@
                 </mc:Choice>
                 <mc:Fallback>
                   <w:pict>
-                    <v:shape id="_x0000_s1026" o:spid="_x0000_s1026" o:spt="202" type="#_x0000_t202" style="position:absolute;left:0pt;margin-left:-4.55pt;margin-top:8pt;height:27pt;width:236.9pt;z-index:251680768;mso-width-relative:page;mso-height-relative:page;" filled="f" stroked="f" coordsize="21600,21600" o:gfxdata="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">
+                    <v:shape id="_x0000_s1026" o:spid="_x0000_s1026" o:spt="202" type="#_x0000_t202" style="position:absolute;left:0pt;margin-left:192.9pt;margin-top:8pt;height:27pt;width:278.85pt;z-index:251680768;mso-width-relative:page;mso-height-relative:page;" filled="f" stroked="f" coordsize="21600,21600" o:gfxdata="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">
                       <v:fill on="f" focussize="0,0"/>
                       <v:stroke on="f" weight="0.5pt"/>
                       <v:imagedata o:title=""/>
@@ -2719,6 +2700,25 @@
                 </mc:Fallback>
               </mc:AlternateContent>
             </w:r>
+            <w:r>
+              <w:rPr>
+                <w:rFonts w:ascii="Arial" w:hAnsi="Arial" w:cs="Arial"/>
+              </w:rPr>
+              <w:t>Motor Number:_______________________</w:t>
+            </w:r>
+          </w:p>
+        </w:tc>
+        <w:tc>
+          <w:tcPr>
+            <w:tcW w:w="4788" w:type="dxa"/>
+          </w:tcPr>
+          <w:p>
+            <w:pPr>
+              <w:spacing w:after="0" w:line="240" w:lineRule="auto"/>
+              <w:rPr>
+                <w:rFonts w:ascii="Arial" w:hAnsi="Arial" w:cs="Arial"/>
+              </w:rPr>
+            </w:pPr>
             <w:r>
               <w:rPr>
                 <w:rFonts w:ascii="Arial" w:hAnsi="Arial" w:cs="Arial"/>
@@ -2769,12 +2769,12 @@
                     <wp:anchor distT="0" distB="0" distL="114300" distR="114300" simplePos="0" relativeHeight="251686912" behindDoc="0" locked="0" layoutInCell="1" allowOverlap="1">
                       <wp:simplePos x="0" y="0"/>
                       <wp:positionH relativeFrom="column">
-                        <wp:posOffset>676910</wp:posOffset>
+                        <wp:posOffset>401320</wp:posOffset>
                       </wp:positionH>
                       <wp:positionV relativeFrom="paragraph">
                         <wp:posOffset>102870</wp:posOffset>
                       </wp:positionV>
-                      <wp:extent cx="3037840" cy="342900"/>
+                      <wp:extent cx="3313430" cy="342900"/>
                       <wp:effectExtent l="0" t="0" r="0" b="0"/>
                       <wp:wrapNone/>
                       <wp:docPr id="30" name="Text Box 30"/>
@@ -2786,7 +2786,7 @@
                             <wps:spPr>
                               <a:xfrm>
                                 <a:off x="0" y="0"/>
-                                <a:ext cx="3037840" cy="342900"/>
+                                <a:ext cx="3313430" cy="342900"/>
                               </a:xfrm>
                               <a:prstGeom prst="rect">
                                 <a:avLst/>
@@ -2861,7 +2861,7 @@
                 </mc:Choice>
                 <mc:Fallback>
                   <w:pict>
-                    <v:shape id="_x0000_s1026" o:spid="_x0000_s1026" o:spt="202" type="#_x0000_t202" style="position:absolute;left:0pt;margin-left:53.3pt;margin-top:8.1pt;height:27pt;width:239.2pt;z-index:251686912;mso-width-relative:page;mso-height-relative:page;" filled="f" stroked="f" coordsize="21600,21600" o:gfxdata="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">
+                    <v:shape id="_x0000_s1026" o:spid="_x0000_s1026" o:spt="202" type="#_x0000_t202" style="position:absolute;left:0pt;margin-left:31.6pt;margin-top:8.1pt;height:27pt;width:260.9pt;z-index:251686912;mso-width-relative:page;mso-height-relative:page;" filled="f" stroked="f" coordsize="21600,21600" o:gfxdata="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">
                       <v:fill on="f" focussize="0,0"/>
                       <v:stroke on="f" weight="0.5pt"/>
                       <v:imagedata o:title=""/>
@@ -2980,12 +2980,12 @@
                     <wp:anchor distT="0" distB="0" distL="114300" distR="114300" simplePos="0" relativeHeight="251665408" behindDoc="0" locked="0" layoutInCell="1" allowOverlap="1">
                       <wp:simplePos x="0" y="0"/>
                       <wp:positionH relativeFrom="column">
-                        <wp:posOffset>867410</wp:posOffset>
+                        <wp:posOffset>668020</wp:posOffset>
                       </wp:positionH>
                       <wp:positionV relativeFrom="paragraph">
                         <wp:posOffset>104140</wp:posOffset>
                       </wp:positionV>
-                      <wp:extent cx="2475865" cy="342900"/>
+                      <wp:extent cx="2675255" cy="342900"/>
                       <wp:effectExtent l="0" t="0" r="0" b="0"/>
                       <wp:wrapNone/>
                       <wp:docPr id="11" name="Text Box 11"/>
@@ -2997,7 +2997,7 @@
                             <wps:spPr>
                               <a:xfrm>
                                 <a:off x="0" y="0"/>
-                                <a:ext cx="2475865" cy="342900"/>
+                                <a:ext cx="2675255" cy="342900"/>
                               </a:xfrm>
                               <a:prstGeom prst="rect">
                                 <a:avLst/>
@@ -3064,7 +3064,7 @@
                 </mc:Choice>
                 <mc:Fallback>
                   <w:pict>
-                    <v:shape id="_x0000_s1026" o:spid="_x0000_s1026" o:spt="202" type="#_x0000_t202" style="position:absolute;left:0pt;margin-left:68.3pt;margin-top:8.2pt;height:27pt;width:194.95pt;z-index:251665408;mso-width-relative:page;mso-height-relative:page;" filled="f" stroked="f" coordsize="21600,21600" o:gfxdata="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">
+                    <v:shape id="_x0000_s1026" o:spid="_x0000_s1026" o:spt="202" type="#_x0000_t202" style="position:absolute;left:0pt;margin-left:52.6pt;margin-top:8.2pt;height:27pt;width:210.65pt;z-index:251665408;mso-width-relative:page;mso-height-relative:page;" filled="f" stroked="f" coordsize="21600,21600" o:gfxdata="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">
                       <v:fill on="f" focussize="0,0"/>
                       <v:stroke on="f" weight="0.5pt"/>
                       <v:imagedata o:title=""/>

</xml_diff>

<commit_message>
conveyance vehicle row adjust
</commit_message>
<xml_diff>
--- a/templates/FSED-38F-Conveyance.docx
+++ b/templates/FSED-38F-Conveyance.docx
@@ -1066,8 +1066,6 @@
         </w:rPr>
         <w:t>FIRE SAFETY CLEARANCE</w:t>
       </w:r>
-      <w:bookmarkStart w:id="0" w:name="_GoBack"/>
-      <w:bookmarkEnd w:id="0"/>
     </w:p>
     <w:p>
       <w:pPr>
@@ -1100,7 +1098,9 @@
           <w:b/>
         </w:rPr>
       </w:pPr>
-    </w:p>
+      <w:bookmarkStart w:id="0" w:name="_GoBack"/>
+    </w:p>
+    <w:bookmarkEnd w:id="0"/>
     <w:p>
       <w:pPr>
         <w:spacing w:after="0"/>
@@ -1703,7 +1703,7 @@
               <wp:anchor distT="0" distB="0" distL="114300" distR="114300" simplePos="0" relativeHeight="251683840" behindDoc="0" locked="0" layoutInCell="1" allowOverlap="1">
                 <wp:simplePos x="0" y="0"/>
                 <wp:positionH relativeFrom="column">
-                  <wp:posOffset>-408305</wp:posOffset>
+                  <wp:posOffset>-294005</wp:posOffset>
                 </wp:positionH>
                 <wp:positionV relativeFrom="paragraph">
                   <wp:posOffset>107950</wp:posOffset>
@@ -1795,7 +1795,7 @@
           </mc:Choice>
           <mc:Fallback>
             <w:pict>
-              <v:shape id="_x0000_s1026" o:spid="_x0000_s1026" o:spt="202" type="#_x0000_t202" style="position:absolute;left:0pt;margin-left:-32.15pt;margin-top:8.5pt;height:27pt;width:258.65pt;z-index:251683840;mso-width-relative:page;mso-height-relative:page;" filled="f" stroked="f" coordsize="21600,21600" o:gfxdata="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">
+              <v:shape id="_x0000_s1026" o:spid="_x0000_s1026" o:spt="202" type="#_x0000_t202" style="position:absolute;left:0pt;margin-left:-23.15pt;margin-top:8.5pt;height:27pt;width:258.65pt;z-index:251683840;mso-width-relative:page;mso-height-relative:page;" filled="f" stroked="f" coordsize="21600,21600" o:gfxdata="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">
                 <v:fill on="f" focussize="0,0"/>
                 <v:stroke on="f" weight="0.5pt"/>
                 <v:imagedata o:title=""/>

</xml_diff>